<commit_message>
Actualización del formulario de actividades
Se actualizó el formulario
</commit_message>
<xml_diff>
--- a/Formulario Actividades.docx
+++ b/Formulario Actividades.docx
@@ -1958,6 +1958,9 @@
               <w:widowControl w:val="0"/>
               <w:spacing w:line="240" w:lineRule="auto"/>
             </w:pPr>
+            <w:r>
+              <w:t>14/09</w:t>
+            </w:r>
           </w:p>
         </w:tc>
         <w:tc>
@@ -1969,6 +1972,9 @@
               <w:widowControl w:val="0"/>
               <w:spacing w:line="240" w:lineRule="auto"/>
             </w:pPr>
+            <w:r>
+              <w:t>17:00</w:t>
+            </w:r>
           </w:p>
         </w:tc>
         <w:tc>
@@ -1980,6 +1986,9 @@
               <w:widowControl w:val="0"/>
               <w:spacing w:line="240" w:lineRule="auto"/>
             </w:pPr>
+            <w:r>
+              <w:t>19:30</w:t>
+            </w:r>
           </w:p>
         </w:tc>
         <w:tc>
@@ -1991,6 +2000,9 @@
               <w:widowControl w:val="0"/>
               <w:spacing w:line="240" w:lineRule="auto"/>
             </w:pPr>
+            <w:r>
+              <w:t>30</w:t>
+            </w:r>
           </w:p>
         </w:tc>
         <w:tc>
@@ -2002,6 +2014,9 @@
               <w:widowControl w:val="0"/>
               <w:spacing w:line="240" w:lineRule="auto"/>
             </w:pPr>
+            <w:r>
+              <w:t>120</w:t>
+            </w:r>
           </w:p>
         </w:tc>
         <w:tc>
@@ -2027,6 +2042,9 @@
               <w:widowControl w:val="0"/>
               <w:spacing w:line="240" w:lineRule="auto"/>
             </w:pPr>
+            <w:r>
+              <w:t>Fui por algo de comer.</w:t>
+            </w:r>
           </w:p>
         </w:tc>
       </w:tr>
@@ -2040,6 +2058,9 @@
               <w:widowControl w:val="0"/>
               <w:spacing w:line="240" w:lineRule="auto"/>
             </w:pPr>
+            <w:r>
+              <w:t>18/09</w:t>
+            </w:r>
           </w:p>
         </w:tc>
         <w:tc>
@@ -2051,6 +2072,9 @@
               <w:widowControl w:val="0"/>
               <w:spacing w:line="240" w:lineRule="auto"/>
             </w:pPr>
+            <w:r>
+              <w:t>15:00</w:t>
+            </w:r>
           </w:p>
         </w:tc>
         <w:tc>
@@ -2062,6 +2086,9 @@
               <w:widowControl w:val="0"/>
               <w:spacing w:line="240" w:lineRule="auto"/>
             </w:pPr>
+            <w:r>
+              <w:t>19:00</w:t>
+            </w:r>
           </w:p>
         </w:tc>
         <w:tc>
@@ -2073,6 +2100,9 @@
               <w:widowControl w:val="0"/>
               <w:spacing w:line="240" w:lineRule="auto"/>
             </w:pPr>
+            <w:r>
+              <w:t>15</w:t>
+            </w:r>
           </w:p>
         </w:tc>
         <w:tc>
@@ -2084,6 +2114,9 @@
               <w:widowControl w:val="0"/>
               <w:spacing w:line="240" w:lineRule="auto"/>
             </w:pPr>
+            <w:r>
+              <w:t>105</w:t>
+            </w:r>
           </w:p>
         </w:tc>
         <w:tc>
@@ -2109,6 +2142,9 @@
               <w:widowControl w:val="0"/>
               <w:spacing w:line="240" w:lineRule="auto"/>
             </w:pPr>
+            <w:r>
+              <w:t>Fui viendo los requisitos de la entrega.</w:t>
+            </w:r>
           </w:p>
         </w:tc>
       </w:tr>
@@ -2122,6 +2158,9 @@
               <w:widowControl w:val="0"/>
               <w:spacing w:line="240" w:lineRule="auto"/>
             </w:pPr>
+            <w:r>
+              <w:t>21/09</w:t>
+            </w:r>
           </w:p>
         </w:tc>
         <w:tc>
@@ -2133,6 +2172,9 @@
               <w:widowControl w:val="0"/>
               <w:spacing w:line="240" w:lineRule="auto"/>
             </w:pPr>
+            <w:r>
+              <w:t>18:00</w:t>
+            </w:r>
           </w:p>
         </w:tc>
         <w:tc>
@@ -2144,6 +2186,9 @@
               <w:widowControl w:val="0"/>
               <w:spacing w:line="240" w:lineRule="auto"/>
             </w:pPr>
+            <w:r>
+              <w:t>18:15</w:t>
+            </w:r>
           </w:p>
         </w:tc>
         <w:tc>
@@ -2155,6 +2200,9 @@
               <w:widowControl w:val="0"/>
               <w:spacing w:line="240" w:lineRule="auto"/>
             </w:pPr>
+            <w:r>
+              <w:t>0</w:t>
+            </w:r>
           </w:p>
         </w:tc>
         <w:tc>
@@ -2166,6 +2214,9 @@
               <w:widowControl w:val="0"/>
               <w:spacing w:line="240" w:lineRule="auto"/>
             </w:pPr>
+            <w:r>
+              <w:t>15</w:t>
+            </w:r>
           </w:p>
         </w:tc>
         <w:tc>
@@ -2191,6 +2242,17 @@
               <w:widowControl w:val="0"/>
               <w:spacing w:line="240" w:lineRule="auto"/>
             </w:pPr>
+            <w:r>
+              <w:t xml:space="preserve">Se entregó en </w:t>
+            </w:r>
+            <w:proofErr w:type="spellStart"/>
+            <w:r>
+              <w:t>canvas</w:t>
+            </w:r>
+            <w:proofErr w:type="spellEnd"/>
+            <w:r>
+              <w:t>.</w:t>
+            </w:r>
           </w:p>
         </w:tc>
       </w:tr>

</xml_diff>

<commit_message>
Completa formulario de actividades y se añade código del backend
</commit_message>
<xml_diff>
--- a/Formulario Actividades.docx
+++ b/Formulario Actividades.docx
@@ -811,10 +811,8 @@
     </w:p>
     <w:tbl>
       <w:tblPr>
-        <w:tblStyle w:val="a0"/>
         <w:tblpPr w:leftFromText="180" w:rightFromText="180" w:topFromText="180" w:bottomFromText="180" w:vertAnchor="text"/>
         <w:tblW w:w="8925" w:type="dxa"/>
-        <w:tblInd w:w="0" w:type="dxa"/>
         <w:tblBorders>
           <w:top w:val="single" w:sz="8" w:space="0" w:color="000000"/>
           <w:left w:val="single" w:sz="8" w:space="0" w:color="000000"/>
@@ -839,11 +837,16 @@
         <w:tc>
           <w:tcPr>
             <w:tcW w:w="885" w:type="dxa"/>
-          </w:tcPr>
-          <w:p>
-            <w:pPr>
-              <w:widowControl w:val="0"/>
-              <w:spacing w:line="240" w:lineRule="auto"/>
+            <w:tcBorders>
+              <w:top w:val="single" w:sz="8" w:space="0" w:color="000000"/>
+              <w:left w:val="single" w:sz="8" w:space="0" w:color="000000"/>
+              <w:bottom w:val="single" w:sz="8" w:space="0" w:color="000000"/>
+              <w:right w:val="single" w:sz="8" w:space="0" w:color="000000"/>
+            </w:tcBorders>
+            <w:hideMark/>
+          </w:tcPr>
+          <w:p>
+            <w:pPr>
               <w:rPr>
                 <w:b/>
                 <w:bCs/>
@@ -861,11 +864,16 @@
         <w:tc>
           <w:tcPr>
             <w:tcW w:w="810" w:type="dxa"/>
-          </w:tcPr>
-          <w:p>
-            <w:pPr>
-              <w:widowControl w:val="0"/>
-              <w:spacing w:line="240" w:lineRule="auto"/>
+            <w:tcBorders>
+              <w:top w:val="single" w:sz="8" w:space="0" w:color="000000"/>
+              <w:left w:val="single" w:sz="8" w:space="0" w:color="000000"/>
+              <w:bottom w:val="single" w:sz="8" w:space="0" w:color="000000"/>
+              <w:right w:val="single" w:sz="8" w:space="0" w:color="000000"/>
+            </w:tcBorders>
+            <w:hideMark/>
+          </w:tcPr>
+          <w:p>
+            <w:pPr>
               <w:rPr>
                 <w:b/>
                 <w:bCs/>
@@ -883,11 +891,16 @@
         <w:tc>
           <w:tcPr>
             <w:tcW w:w="795" w:type="dxa"/>
-          </w:tcPr>
-          <w:p>
-            <w:pPr>
-              <w:widowControl w:val="0"/>
-              <w:spacing w:line="240" w:lineRule="auto"/>
+            <w:tcBorders>
+              <w:top w:val="single" w:sz="8" w:space="0" w:color="000000"/>
+              <w:left w:val="single" w:sz="8" w:space="0" w:color="000000"/>
+              <w:bottom w:val="single" w:sz="8" w:space="0" w:color="000000"/>
+              <w:right w:val="single" w:sz="8" w:space="0" w:color="000000"/>
+            </w:tcBorders>
+            <w:hideMark/>
+          </w:tcPr>
+          <w:p>
+            <w:pPr>
               <w:rPr>
                 <w:b/>
                 <w:bCs/>
@@ -905,11 +918,16 @@
         <w:tc>
           <w:tcPr>
             <w:tcW w:w="1590" w:type="dxa"/>
-          </w:tcPr>
-          <w:p>
-            <w:pPr>
-              <w:widowControl w:val="0"/>
-              <w:spacing w:line="240" w:lineRule="auto"/>
+            <w:tcBorders>
+              <w:top w:val="single" w:sz="8" w:space="0" w:color="000000"/>
+              <w:left w:val="single" w:sz="8" w:space="0" w:color="000000"/>
+              <w:bottom w:val="single" w:sz="8" w:space="0" w:color="000000"/>
+              <w:right w:val="single" w:sz="8" w:space="0" w:color="000000"/>
+            </w:tcBorders>
+            <w:hideMark/>
+          </w:tcPr>
+          <w:p>
+            <w:pPr>
               <w:rPr>
                 <w:b/>
                 <w:bCs/>
@@ -925,8 +943,6 @@
           </w:p>
           <w:p>
             <w:pPr>
-              <w:widowControl w:val="0"/>
-              <w:spacing w:line="240" w:lineRule="auto"/>
               <w:rPr>
                 <w:b/>
                 <w:bCs/>
@@ -944,11 +960,16 @@
         <w:tc>
           <w:tcPr>
             <w:tcW w:w="1260" w:type="dxa"/>
-          </w:tcPr>
-          <w:p>
-            <w:pPr>
-              <w:widowControl w:val="0"/>
-              <w:spacing w:line="240" w:lineRule="auto"/>
+            <w:tcBorders>
+              <w:top w:val="single" w:sz="8" w:space="0" w:color="000000"/>
+              <w:left w:val="single" w:sz="8" w:space="0" w:color="000000"/>
+              <w:bottom w:val="single" w:sz="8" w:space="0" w:color="000000"/>
+              <w:right w:val="single" w:sz="8" w:space="0" w:color="000000"/>
+            </w:tcBorders>
+            <w:hideMark/>
+          </w:tcPr>
+          <w:p>
+            <w:pPr>
               <w:rPr>
                 <w:b/>
                 <w:bCs/>
@@ -966,11 +987,16 @@
         <w:tc>
           <w:tcPr>
             <w:tcW w:w="1965" w:type="dxa"/>
-          </w:tcPr>
-          <w:p>
-            <w:pPr>
-              <w:widowControl w:val="0"/>
-              <w:spacing w:line="240" w:lineRule="auto"/>
+            <w:tcBorders>
+              <w:top w:val="single" w:sz="8" w:space="0" w:color="000000"/>
+              <w:left w:val="single" w:sz="8" w:space="0" w:color="000000"/>
+              <w:bottom w:val="single" w:sz="8" w:space="0" w:color="000000"/>
+              <w:right w:val="single" w:sz="8" w:space="0" w:color="000000"/>
+            </w:tcBorders>
+            <w:hideMark/>
+          </w:tcPr>
+          <w:p>
+            <w:pPr>
               <w:rPr>
                 <w:b/>
                 <w:bCs/>
@@ -988,11 +1014,16 @@
         <w:tc>
           <w:tcPr>
             <w:tcW w:w="1620" w:type="dxa"/>
-          </w:tcPr>
-          <w:p>
-            <w:pPr>
-              <w:widowControl w:val="0"/>
-              <w:spacing w:line="240" w:lineRule="auto"/>
+            <w:tcBorders>
+              <w:top w:val="single" w:sz="8" w:space="0" w:color="000000"/>
+              <w:left w:val="single" w:sz="8" w:space="0" w:color="000000"/>
+              <w:bottom w:val="single" w:sz="8" w:space="0" w:color="000000"/>
+              <w:right w:val="single" w:sz="8" w:space="0" w:color="000000"/>
+            </w:tcBorders>
+            <w:hideMark/>
+          </w:tcPr>
+          <w:p>
+            <w:pPr>
               <w:rPr>
                 <w:b/>
                 <w:bCs/>
@@ -1012,67 +1043,100 @@
         <w:tc>
           <w:tcPr>
             <w:tcW w:w="885" w:type="dxa"/>
-          </w:tcPr>
-          <w:p>
-            <w:pPr>
-              <w:widowControl w:val="0"/>
-              <w:spacing w:line="240" w:lineRule="auto"/>
-            </w:pPr>
+            <w:tcBorders>
+              <w:top w:val="single" w:sz="8" w:space="0" w:color="000000"/>
+              <w:left w:val="single" w:sz="8" w:space="0" w:color="000000"/>
+              <w:bottom w:val="single" w:sz="8" w:space="0" w:color="000000"/>
+              <w:right w:val="single" w:sz="8" w:space="0" w:color="000000"/>
+            </w:tcBorders>
+            <w:hideMark/>
+          </w:tcPr>
+          <w:p>
+            <w:r>
+              <w:t>25/08</w:t>
+            </w:r>
           </w:p>
         </w:tc>
         <w:tc>
           <w:tcPr>
             <w:tcW w:w="810" w:type="dxa"/>
-          </w:tcPr>
-          <w:p>
-            <w:pPr>
-              <w:widowControl w:val="0"/>
-              <w:spacing w:line="240" w:lineRule="auto"/>
-            </w:pPr>
+            <w:tcBorders>
+              <w:top w:val="single" w:sz="8" w:space="0" w:color="000000"/>
+              <w:left w:val="single" w:sz="8" w:space="0" w:color="000000"/>
+              <w:bottom w:val="single" w:sz="8" w:space="0" w:color="000000"/>
+              <w:right w:val="single" w:sz="8" w:space="0" w:color="000000"/>
+            </w:tcBorders>
+            <w:hideMark/>
+          </w:tcPr>
+          <w:p>
+            <w:r>
+              <w:t>18:00</w:t>
+            </w:r>
           </w:p>
         </w:tc>
         <w:tc>
           <w:tcPr>
             <w:tcW w:w="795" w:type="dxa"/>
-          </w:tcPr>
-          <w:p>
-            <w:pPr>
-              <w:widowControl w:val="0"/>
-              <w:spacing w:line="240" w:lineRule="auto"/>
-            </w:pPr>
+            <w:tcBorders>
+              <w:top w:val="single" w:sz="8" w:space="0" w:color="000000"/>
+              <w:left w:val="single" w:sz="8" w:space="0" w:color="000000"/>
+              <w:bottom w:val="single" w:sz="8" w:space="0" w:color="000000"/>
+              <w:right w:val="single" w:sz="8" w:space="0" w:color="000000"/>
+            </w:tcBorders>
+            <w:hideMark/>
+          </w:tcPr>
+          <w:p>
+            <w:r>
+              <w:t>19:00</w:t>
+            </w:r>
           </w:p>
         </w:tc>
         <w:tc>
           <w:tcPr>
             <w:tcW w:w="1590" w:type="dxa"/>
-          </w:tcPr>
-          <w:p>
-            <w:pPr>
-              <w:widowControl w:val="0"/>
-              <w:spacing w:line="240" w:lineRule="auto"/>
-            </w:pPr>
+            <w:tcBorders>
+              <w:top w:val="single" w:sz="8" w:space="0" w:color="000000"/>
+              <w:left w:val="single" w:sz="8" w:space="0" w:color="000000"/>
+              <w:bottom w:val="single" w:sz="8" w:space="0" w:color="000000"/>
+              <w:right w:val="single" w:sz="8" w:space="0" w:color="000000"/>
+            </w:tcBorders>
+            <w:hideMark/>
+          </w:tcPr>
+          <w:p>
+            <w:r>
+              <w:t>15</w:t>
+            </w:r>
           </w:p>
         </w:tc>
         <w:tc>
           <w:tcPr>
             <w:tcW w:w="1260" w:type="dxa"/>
-          </w:tcPr>
-          <w:p>
-            <w:pPr>
-              <w:widowControl w:val="0"/>
-              <w:spacing w:line="240" w:lineRule="auto"/>
-            </w:pPr>
+            <w:tcBorders>
+              <w:top w:val="single" w:sz="8" w:space="0" w:color="000000"/>
+              <w:left w:val="single" w:sz="8" w:space="0" w:color="000000"/>
+              <w:bottom w:val="single" w:sz="8" w:space="0" w:color="000000"/>
+              <w:right w:val="single" w:sz="8" w:space="0" w:color="000000"/>
+            </w:tcBorders>
+            <w:hideMark/>
+          </w:tcPr>
+          <w:p>
+            <w:r>
+              <w:t>45</w:t>
+            </w:r>
           </w:p>
         </w:tc>
         <w:tc>
           <w:tcPr>
             <w:tcW w:w="1965" w:type="dxa"/>
-          </w:tcPr>
-          <w:p>
-            <w:pPr>
-              <w:widowControl w:val="0"/>
-              <w:spacing w:line="240" w:lineRule="auto"/>
-            </w:pPr>
+            <w:tcBorders>
+              <w:top w:val="single" w:sz="8" w:space="0" w:color="000000"/>
+              <w:left w:val="single" w:sz="8" w:space="0" w:color="000000"/>
+              <w:bottom w:val="single" w:sz="8" w:space="0" w:color="000000"/>
+              <w:right w:val="single" w:sz="8" w:space="0" w:color="000000"/>
+            </w:tcBorders>
+            <w:hideMark/>
+          </w:tcPr>
+          <w:p>
             <w:r>
               <w:t>Identificación de requisitos</w:t>
             </w:r>
@@ -1081,12 +1145,18 @@
         <w:tc>
           <w:tcPr>
             <w:tcW w:w="1620" w:type="dxa"/>
-          </w:tcPr>
-          <w:p>
-            <w:pPr>
-              <w:widowControl w:val="0"/>
-              <w:spacing w:line="240" w:lineRule="auto"/>
-            </w:pPr>
+            <w:tcBorders>
+              <w:top w:val="single" w:sz="8" w:space="0" w:color="000000"/>
+              <w:left w:val="single" w:sz="8" w:space="0" w:color="000000"/>
+              <w:bottom w:val="single" w:sz="8" w:space="0" w:color="000000"/>
+              <w:right w:val="single" w:sz="8" w:space="0" w:color="000000"/>
+            </w:tcBorders>
+            <w:hideMark/>
+          </w:tcPr>
+          <w:p>
+            <w:r>
+              <w:t>Complicado</w:t>
+            </w:r>
           </w:p>
         </w:tc>
       </w:tr>
@@ -1094,67 +1164,100 @@
         <w:tc>
           <w:tcPr>
             <w:tcW w:w="885" w:type="dxa"/>
-          </w:tcPr>
-          <w:p>
-            <w:pPr>
-              <w:widowControl w:val="0"/>
-              <w:spacing w:line="240" w:lineRule="auto"/>
-            </w:pPr>
+            <w:tcBorders>
+              <w:top w:val="single" w:sz="8" w:space="0" w:color="000000"/>
+              <w:left w:val="single" w:sz="8" w:space="0" w:color="000000"/>
+              <w:bottom w:val="single" w:sz="8" w:space="0" w:color="000000"/>
+              <w:right w:val="single" w:sz="8" w:space="0" w:color="000000"/>
+            </w:tcBorders>
+            <w:hideMark/>
+          </w:tcPr>
+          <w:p>
+            <w:r>
+              <w:t>26/08</w:t>
+            </w:r>
           </w:p>
         </w:tc>
         <w:tc>
           <w:tcPr>
             <w:tcW w:w="810" w:type="dxa"/>
-          </w:tcPr>
-          <w:p>
-            <w:pPr>
-              <w:widowControl w:val="0"/>
-              <w:spacing w:line="240" w:lineRule="auto"/>
-            </w:pPr>
+            <w:tcBorders>
+              <w:top w:val="single" w:sz="8" w:space="0" w:color="000000"/>
+              <w:left w:val="single" w:sz="8" w:space="0" w:color="000000"/>
+              <w:bottom w:val="single" w:sz="8" w:space="0" w:color="000000"/>
+              <w:right w:val="single" w:sz="8" w:space="0" w:color="000000"/>
+            </w:tcBorders>
+            <w:hideMark/>
+          </w:tcPr>
+          <w:p>
+            <w:r>
+              <w:t>18:00</w:t>
+            </w:r>
           </w:p>
         </w:tc>
         <w:tc>
           <w:tcPr>
             <w:tcW w:w="795" w:type="dxa"/>
-          </w:tcPr>
-          <w:p>
-            <w:pPr>
-              <w:widowControl w:val="0"/>
-              <w:spacing w:line="240" w:lineRule="auto"/>
-            </w:pPr>
+            <w:tcBorders>
+              <w:top w:val="single" w:sz="8" w:space="0" w:color="000000"/>
+              <w:left w:val="single" w:sz="8" w:space="0" w:color="000000"/>
+              <w:bottom w:val="single" w:sz="8" w:space="0" w:color="000000"/>
+              <w:right w:val="single" w:sz="8" w:space="0" w:color="000000"/>
+            </w:tcBorders>
+            <w:hideMark/>
+          </w:tcPr>
+          <w:p>
+            <w:r>
+              <w:t>19:30</w:t>
+            </w:r>
           </w:p>
         </w:tc>
         <w:tc>
           <w:tcPr>
             <w:tcW w:w="1590" w:type="dxa"/>
-          </w:tcPr>
-          <w:p>
-            <w:pPr>
-              <w:widowControl w:val="0"/>
-              <w:spacing w:line="240" w:lineRule="auto"/>
-            </w:pPr>
+            <w:tcBorders>
+              <w:top w:val="single" w:sz="8" w:space="0" w:color="000000"/>
+              <w:left w:val="single" w:sz="8" w:space="0" w:color="000000"/>
+              <w:bottom w:val="single" w:sz="8" w:space="0" w:color="000000"/>
+              <w:right w:val="single" w:sz="8" w:space="0" w:color="000000"/>
+            </w:tcBorders>
+            <w:hideMark/>
+          </w:tcPr>
+          <w:p>
+            <w:r>
+              <w:t>15</w:t>
+            </w:r>
           </w:p>
         </w:tc>
         <w:tc>
           <w:tcPr>
             <w:tcW w:w="1260" w:type="dxa"/>
-          </w:tcPr>
-          <w:p>
-            <w:pPr>
-              <w:widowControl w:val="0"/>
-              <w:spacing w:line="240" w:lineRule="auto"/>
-            </w:pPr>
+            <w:tcBorders>
+              <w:top w:val="single" w:sz="8" w:space="0" w:color="000000"/>
+              <w:left w:val="single" w:sz="8" w:space="0" w:color="000000"/>
+              <w:bottom w:val="single" w:sz="8" w:space="0" w:color="000000"/>
+              <w:right w:val="single" w:sz="8" w:space="0" w:color="000000"/>
+            </w:tcBorders>
+            <w:hideMark/>
+          </w:tcPr>
+          <w:p>
+            <w:r>
+              <w:t>75</w:t>
+            </w:r>
           </w:p>
         </w:tc>
         <w:tc>
           <w:tcPr>
             <w:tcW w:w="1965" w:type="dxa"/>
-          </w:tcPr>
-          <w:p>
-            <w:pPr>
-              <w:widowControl w:val="0"/>
-              <w:spacing w:line="240" w:lineRule="auto"/>
-            </w:pPr>
+            <w:tcBorders>
+              <w:top w:val="single" w:sz="8" w:space="0" w:color="000000"/>
+              <w:left w:val="single" w:sz="8" w:space="0" w:color="000000"/>
+              <w:bottom w:val="single" w:sz="8" w:space="0" w:color="000000"/>
+              <w:right w:val="single" w:sz="8" w:space="0" w:color="000000"/>
+            </w:tcBorders>
+            <w:hideMark/>
+          </w:tcPr>
+          <w:p>
             <w:r>
               <w:t xml:space="preserve">Investigación de la tecnología disponible </w:t>
             </w:r>
@@ -1163,12 +1266,18 @@
         <w:tc>
           <w:tcPr>
             <w:tcW w:w="1620" w:type="dxa"/>
-          </w:tcPr>
-          <w:p>
-            <w:pPr>
-              <w:widowControl w:val="0"/>
-              <w:spacing w:line="240" w:lineRule="auto"/>
-            </w:pPr>
+            <w:tcBorders>
+              <w:top w:val="single" w:sz="8" w:space="0" w:color="000000"/>
+              <w:left w:val="single" w:sz="8" w:space="0" w:color="000000"/>
+              <w:bottom w:val="single" w:sz="8" w:space="0" w:color="000000"/>
+              <w:right w:val="single" w:sz="8" w:space="0" w:color="000000"/>
+            </w:tcBorders>
+            <w:hideMark/>
+          </w:tcPr>
+          <w:p>
+            <w:r>
+              <w:t>Tenía claro qué buscar</w:t>
+            </w:r>
           </w:p>
         </w:tc>
       </w:tr>
@@ -1176,67 +1285,100 @@
         <w:tc>
           <w:tcPr>
             <w:tcW w:w="885" w:type="dxa"/>
-          </w:tcPr>
-          <w:p>
-            <w:pPr>
-              <w:widowControl w:val="0"/>
-              <w:spacing w:line="240" w:lineRule="auto"/>
-            </w:pPr>
+            <w:tcBorders>
+              <w:top w:val="single" w:sz="8" w:space="0" w:color="000000"/>
+              <w:left w:val="single" w:sz="8" w:space="0" w:color="000000"/>
+              <w:bottom w:val="single" w:sz="8" w:space="0" w:color="000000"/>
+              <w:right w:val="single" w:sz="8" w:space="0" w:color="000000"/>
+            </w:tcBorders>
+            <w:hideMark/>
+          </w:tcPr>
+          <w:p>
+            <w:r>
+              <w:t>26/08</w:t>
+            </w:r>
           </w:p>
         </w:tc>
         <w:tc>
           <w:tcPr>
             <w:tcW w:w="810" w:type="dxa"/>
-          </w:tcPr>
-          <w:p>
-            <w:pPr>
-              <w:widowControl w:val="0"/>
-              <w:spacing w:line="240" w:lineRule="auto"/>
-            </w:pPr>
+            <w:tcBorders>
+              <w:top w:val="single" w:sz="8" w:space="0" w:color="000000"/>
+              <w:left w:val="single" w:sz="8" w:space="0" w:color="000000"/>
+              <w:bottom w:val="single" w:sz="8" w:space="0" w:color="000000"/>
+              <w:right w:val="single" w:sz="8" w:space="0" w:color="000000"/>
+            </w:tcBorders>
+            <w:hideMark/>
+          </w:tcPr>
+          <w:p>
+            <w:r>
+              <w:t>19:30</w:t>
+            </w:r>
           </w:p>
         </w:tc>
         <w:tc>
           <w:tcPr>
             <w:tcW w:w="795" w:type="dxa"/>
-          </w:tcPr>
-          <w:p>
-            <w:pPr>
-              <w:widowControl w:val="0"/>
-              <w:spacing w:line="240" w:lineRule="auto"/>
-            </w:pPr>
+            <w:tcBorders>
+              <w:top w:val="single" w:sz="8" w:space="0" w:color="000000"/>
+              <w:left w:val="single" w:sz="8" w:space="0" w:color="000000"/>
+              <w:bottom w:val="single" w:sz="8" w:space="0" w:color="000000"/>
+              <w:right w:val="single" w:sz="8" w:space="0" w:color="000000"/>
+            </w:tcBorders>
+            <w:hideMark/>
+          </w:tcPr>
+          <w:p>
+            <w:r>
+              <w:t>21:30</w:t>
+            </w:r>
           </w:p>
         </w:tc>
         <w:tc>
           <w:tcPr>
             <w:tcW w:w="1590" w:type="dxa"/>
-          </w:tcPr>
-          <w:p>
-            <w:pPr>
-              <w:widowControl w:val="0"/>
-              <w:spacing w:line="240" w:lineRule="auto"/>
-            </w:pPr>
+            <w:tcBorders>
+              <w:top w:val="single" w:sz="8" w:space="0" w:color="000000"/>
+              <w:left w:val="single" w:sz="8" w:space="0" w:color="000000"/>
+              <w:bottom w:val="single" w:sz="8" w:space="0" w:color="000000"/>
+              <w:right w:val="single" w:sz="8" w:space="0" w:color="000000"/>
+            </w:tcBorders>
+            <w:hideMark/>
+          </w:tcPr>
+          <w:p>
+            <w:r>
+              <w:t>40</w:t>
+            </w:r>
           </w:p>
         </w:tc>
         <w:tc>
           <w:tcPr>
             <w:tcW w:w="1260" w:type="dxa"/>
-          </w:tcPr>
-          <w:p>
-            <w:pPr>
-              <w:widowControl w:val="0"/>
-              <w:spacing w:line="240" w:lineRule="auto"/>
-            </w:pPr>
+            <w:tcBorders>
+              <w:top w:val="single" w:sz="8" w:space="0" w:color="000000"/>
+              <w:left w:val="single" w:sz="8" w:space="0" w:color="000000"/>
+              <w:bottom w:val="single" w:sz="8" w:space="0" w:color="000000"/>
+              <w:right w:val="single" w:sz="8" w:space="0" w:color="000000"/>
+            </w:tcBorders>
+            <w:hideMark/>
+          </w:tcPr>
+          <w:p>
+            <w:r>
+              <w:t>80</w:t>
+            </w:r>
           </w:p>
         </w:tc>
         <w:tc>
           <w:tcPr>
             <w:tcW w:w="1965" w:type="dxa"/>
-          </w:tcPr>
-          <w:p>
-            <w:pPr>
-              <w:widowControl w:val="0"/>
-              <w:spacing w:line="240" w:lineRule="auto"/>
-            </w:pPr>
+            <w:tcBorders>
+              <w:top w:val="single" w:sz="8" w:space="0" w:color="000000"/>
+              <w:left w:val="single" w:sz="8" w:space="0" w:color="000000"/>
+              <w:bottom w:val="single" w:sz="8" w:space="0" w:color="000000"/>
+              <w:right w:val="single" w:sz="8" w:space="0" w:color="000000"/>
+            </w:tcBorders>
+            <w:hideMark/>
+          </w:tcPr>
+          <w:p>
             <w:r>
               <w:t>Investigación para persistencia de datos</w:t>
             </w:r>
@@ -1245,12 +1387,18 @@
         <w:tc>
           <w:tcPr>
             <w:tcW w:w="1620" w:type="dxa"/>
-          </w:tcPr>
-          <w:p>
-            <w:pPr>
-              <w:widowControl w:val="0"/>
-              <w:spacing w:line="240" w:lineRule="auto"/>
-            </w:pPr>
+            <w:tcBorders>
+              <w:top w:val="single" w:sz="8" w:space="0" w:color="000000"/>
+              <w:left w:val="single" w:sz="8" w:space="0" w:color="000000"/>
+              <w:bottom w:val="single" w:sz="8" w:space="0" w:color="000000"/>
+              <w:right w:val="single" w:sz="8" w:space="0" w:color="000000"/>
+            </w:tcBorders>
+            <w:hideMark/>
+          </w:tcPr>
+          <w:p>
+            <w:r>
+              <w:t>Tenía claro qué buscar</w:t>
+            </w:r>
           </w:p>
         </w:tc>
       </w:tr>
@@ -1258,67 +1406,100 @@
         <w:tc>
           <w:tcPr>
             <w:tcW w:w="885" w:type="dxa"/>
-          </w:tcPr>
-          <w:p>
-            <w:pPr>
-              <w:widowControl w:val="0"/>
-              <w:spacing w:line="240" w:lineRule="auto"/>
-            </w:pPr>
+            <w:tcBorders>
+              <w:top w:val="single" w:sz="8" w:space="0" w:color="000000"/>
+              <w:left w:val="single" w:sz="8" w:space="0" w:color="000000"/>
+              <w:bottom w:val="single" w:sz="8" w:space="0" w:color="000000"/>
+              <w:right w:val="single" w:sz="8" w:space="0" w:color="000000"/>
+            </w:tcBorders>
+            <w:hideMark/>
+          </w:tcPr>
+          <w:p>
+            <w:r>
+              <w:t>09/09</w:t>
+            </w:r>
           </w:p>
         </w:tc>
         <w:tc>
           <w:tcPr>
             <w:tcW w:w="810" w:type="dxa"/>
-          </w:tcPr>
-          <w:p>
-            <w:pPr>
-              <w:widowControl w:val="0"/>
-              <w:spacing w:line="240" w:lineRule="auto"/>
-            </w:pPr>
+            <w:tcBorders>
+              <w:top w:val="single" w:sz="8" w:space="0" w:color="000000"/>
+              <w:left w:val="single" w:sz="8" w:space="0" w:color="000000"/>
+              <w:bottom w:val="single" w:sz="8" w:space="0" w:color="000000"/>
+              <w:right w:val="single" w:sz="8" w:space="0" w:color="000000"/>
+            </w:tcBorders>
+            <w:hideMark/>
+          </w:tcPr>
+          <w:p>
+            <w:r>
+              <w:t>16:30</w:t>
+            </w:r>
           </w:p>
         </w:tc>
         <w:tc>
           <w:tcPr>
             <w:tcW w:w="795" w:type="dxa"/>
-          </w:tcPr>
-          <w:p>
-            <w:pPr>
-              <w:widowControl w:val="0"/>
-              <w:spacing w:line="240" w:lineRule="auto"/>
-            </w:pPr>
+            <w:tcBorders>
+              <w:top w:val="single" w:sz="8" w:space="0" w:color="000000"/>
+              <w:left w:val="single" w:sz="8" w:space="0" w:color="000000"/>
+              <w:bottom w:val="single" w:sz="8" w:space="0" w:color="000000"/>
+              <w:right w:val="single" w:sz="8" w:space="0" w:color="000000"/>
+            </w:tcBorders>
+            <w:hideMark/>
+          </w:tcPr>
+          <w:p>
+            <w:r>
+              <w:t>17:30</w:t>
+            </w:r>
           </w:p>
         </w:tc>
         <w:tc>
           <w:tcPr>
             <w:tcW w:w="1590" w:type="dxa"/>
-          </w:tcPr>
-          <w:p>
-            <w:pPr>
-              <w:widowControl w:val="0"/>
-              <w:spacing w:line="240" w:lineRule="auto"/>
-            </w:pPr>
+            <w:tcBorders>
+              <w:top w:val="single" w:sz="8" w:space="0" w:color="000000"/>
+              <w:left w:val="single" w:sz="8" w:space="0" w:color="000000"/>
+              <w:bottom w:val="single" w:sz="8" w:space="0" w:color="000000"/>
+              <w:right w:val="single" w:sz="8" w:space="0" w:color="000000"/>
+            </w:tcBorders>
+            <w:hideMark/>
+          </w:tcPr>
+          <w:p>
+            <w:r>
+              <w:t>10</w:t>
+            </w:r>
           </w:p>
         </w:tc>
         <w:tc>
           <w:tcPr>
             <w:tcW w:w="1260" w:type="dxa"/>
-          </w:tcPr>
-          <w:p>
-            <w:pPr>
-              <w:widowControl w:val="0"/>
-              <w:spacing w:line="240" w:lineRule="auto"/>
-            </w:pPr>
+            <w:tcBorders>
+              <w:top w:val="single" w:sz="8" w:space="0" w:color="000000"/>
+              <w:left w:val="single" w:sz="8" w:space="0" w:color="000000"/>
+              <w:bottom w:val="single" w:sz="8" w:space="0" w:color="000000"/>
+              <w:right w:val="single" w:sz="8" w:space="0" w:color="000000"/>
+            </w:tcBorders>
+            <w:hideMark/>
+          </w:tcPr>
+          <w:p>
+            <w:r>
+              <w:t>50</w:t>
+            </w:r>
           </w:p>
         </w:tc>
         <w:tc>
           <w:tcPr>
             <w:tcW w:w="1965" w:type="dxa"/>
-          </w:tcPr>
-          <w:p>
-            <w:pPr>
-              <w:widowControl w:val="0"/>
-              <w:spacing w:line="240" w:lineRule="auto"/>
-            </w:pPr>
+            <w:tcBorders>
+              <w:top w:val="single" w:sz="8" w:space="0" w:color="000000"/>
+              <w:left w:val="single" w:sz="8" w:space="0" w:color="000000"/>
+              <w:bottom w:val="single" w:sz="8" w:space="0" w:color="000000"/>
+              <w:right w:val="single" w:sz="8" w:space="0" w:color="000000"/>
+            </w:tcBorders>
+            <w:hideMark/>
+          </w:tcPr>
+          <w:p>
             <w:r>
               <w:t>Revisión</w:t>
             </w:r>
@@ -1327,12 +1508,18 @@
         <w:tc>
           <w:tcPr>
             <w:tcW w:w="1620" w:type="dxa"/>
-          </w:tcPr>
-          <w:p>
-            <w:pPr>
-              <w:widowControl w:val="0"/>
-              <w:spacing w:line="240" w:lineRule="auto"/>
-            </w:pPr>
+            <w:tcBorders>
+              <w:top w:val="single" w:sz="8" w:space="0" w:color="000000"/>
+              <w:left w:val="single" w:sz="8" w:space="0" w:color="000000"/>
+              <w:bottom w:val="single" w:sz="8" w:space="0" w:color="000000"/>
+              <w:right w:val="single" w:sz="8" w:space="0" w:color="000000"/>
+            </w:tcBorders>
+            <w:hideMark/>
+          </w:tcPr>
+          <w:p>
+            <w:r>
+              <w:t>Complicado de organizar</w:t>
+            </w:r>
           </w:p>
         </w:tc>
       </w:tr>
@@ -1340,67 +1527,100 @@
         <w:tc>
           <w:tcPr>
             <w:tcW w:w="885" w:type="dxa"/>
-          </w:tcPr>
-          <w:p>
-            <w:pPr>
-              <w:widowControl w:val="0"/>
-              <w:spacing w:line="240" w:lineRule="auto"/>
-            </w:pPr>
+            <w:tcBorders>
+              <w:top w:val="single" w:sz="8" w:space="0" w:color="000000"/>
+              <w:left w:val="single" w:sz="8" w:space="0" w:color="000000"/>
+              <w:bottom w:val="single" w:sz="8" w:space="0" w:color="000000"/>
+              <w:right w:val="single" w:sz="8" w:space="0" w:color="000000"/>
+            </w:tcBorders>
+            <w:hideMark/>
+          </w:tcPr>
+          <w:p>
+            <w:r>
+              <w:t>21/09</w:t>
+            </w:r>
           </w:p>
         </w:tc>
         <w:tc>
           <w:tcPr>
             <w:tcW w:w="810" w:type="dxa"/>
-          </w:tcPr>
-          <w:p>
-            <w:pPr>
-              <w:widowControl w:val="0"/>
-              <w:spacing w:line="240" w:lineRule="auto"/>
-            </w:pPr>
+            <w:tcBorders>
+              <w:top w:val="single" w:sz="8" w:space="0" w:color="000000"/>
+              <w:left w:val="single" w:sz="8" w:space="0" w:color="000000"/>
+              <w:bottom w:val="single" w:sz="8" w:space="0" w:color="000000"/>
+              <w:right w:val="single" w:sz="8" w:space="0" w:color="000000"/>
+            </w:tcBorders>
+            <w:hideMark/>
+          </w:tcPr>
+          <w:p>
+            <w:r>
+              <w:t>14:00</w:t>
+            </w:r>
           </w:p>
         </w:tc>
         <w:tc>
           <w:tcPr>
             <w:tcW w:w="795" w:type="dxa"/>
-          </w:tcPr>
-          <w:p>
-            <w:pPr>
-              <w:widowControl w:val="0"/>
-              <w:spacing w:line="240" w:lineRule="auto"/>
-            </w:pPr>
+            <w:tcBorders>
+              <w:top w:val="single" w:sz="8" w:space="0" w:color="000000"/>
+              <w:left w:val="single" w:sz="8" w:space="0" w:color="000000"/>
+              <w:bottom w:val="single" w:sz="8" w:space="0" w:color="000000"/>
+              <w:right w:val="single" w:sz="8" w:space="0" w:color="000000"/>
+            </w:tcBorders>
+            <w:hideMark/>
+          </w:tcPr>
+          <w:p>
+            <w:r>
+              <w:t>19:00</w:t>
+            </w:r>
           </w:p>
         </w:tc>
         <w:tc>
           <w:tcPr>
             <w:tcW w:w="1590" w:type="dxa"/>
-          </w:tcPr>
-          <w:p>
-            <w:pPr>
-              <w:widowControl w:val="0"/>
-              <w:spacing w:line="240" w:lineRule="auto"/>
-            </w:pPr>
+            <w:tcBorders>
+              <w:top w:val="single" w:sz="8" w:space="0" w:color="000000"/>
+              <w:left w:val="single" w:sz="8" w:space="0" w:color="000000"/>
+              <w:bottom w:val="single" w:sz="8" w:space="0" w:color="000000"/>
+              <w:right w:val="single" w:sz="8" w:space="0" w:color="000000"/>
+            </w:tcBorders>
+            <w:hideMark/>
+          </w:tcPr>
+          <w:p>
+            <w:r>
+              <w:t>50</w:t>
+            </w:r>
           </w:p>
         </w:tc>
         <w:tc>
           <w:tcPr>
             <w:tcW w:w="1260" w:type="dxa"/>
-          </w:tcPr>
-          <w:p>
-            <w:pPr>
-              <w:widowControl w:val="0"/>
-              <w:spacing w:line="240" w:lineRule="auto"/>
-            </w:pPr>
+            <w:tcBorders>
+              <w:top w:val="single" w:sz="8" w:space="0" w:color="000000"/>
+              <w:left w:val="single" w:sz="8" w:space="0" w:color="000000"/>
+              <w:bottom w:val="single" w:sz="8" w:space="0" w:color="000000"/>
+              <w:right w:val="single" w:sz="8" w:space="0" w:color="000000"/>
+            </w:tcBorders>
+            <w:hideMark/>
+          </w:tcPr>
+          <w:p>
+            <w:r>
+              <w:t>250</w:t>
+            </w:r>
           </w:p>
         </w:tc>
         <w:tc>
           <w:tcPr>
             <w:tcW w:w="1965" w:type="dxa"/>
-          </w:tcPr>
-          <w:p>
-            <w:pPr>
-              <w:widowControl w:val="0"/>
-              <w:spacing w:line="240" w:lineRule="auto"/>
-            </w:pPr>
+            <w:tcBorders>
+              <w:top w:val="single" w:sz="8" w:space="0" w:color="000000"/>
+              <w:left w:val="single" w:sz="8" w:space="0" w:color="000000"/>
+              <w:bottom w:val="single" w:sz="8" w:space="0" w:color="000000"/>
+              <w:right w:val="single" w:sz="8" w:space="0" w:color="000000"/>
+            </w:tcBorders>
+            <w:hideMark/>
+          </w:tcPr>
+          <w:p>
             <w:r>
               <w:t>Entrega</w:t>
             </w:r>
@@ -1409,17 +1629,29 @@
         <w:tc>
           <w:tcPr>
             <w:tcW w:w="1620" w:type="dxa"/>
-          </w:tcPr>
-          <w:p>
-            <w:pPr>
-              <w:widowControl w:val="0"/>
-              <w:spacing w:line="240" w:lineRule="auto"/>
-            </w:pPr>
+            <w:tcBorders>
+              <w:top w:val="single" w:sz="8" w:space="0" w:color="000000"/>
+              <w:left w:val="single" w:sz="8" w:space="0" w:color="000000"/>
+              <w:bottom w:val="single" w:sz="8" w:space="0" w:color="000000"/>
+              <w:right w:val="single" w:sz="8" w:space="0" w:color="000000"/>
+            </w:tcBorders>
+            <w:hideMark/>
+          </w:tcPr>
+          <w:p>
+            <w:r>
+              <w:t>Complicado de llevar a cabo</w:t>
+            </w:r>
           </w:p>
         </w:tc>
       </w:tr>
     </w:tbl>
-    <w:p/>
+    <w:p>
+      <w:pPr>
+        <w:rPr>
+          <w:lang w:val="es-GT"/>
+        </w:rPr>
+      </w:pPr>
+    </w:p>
     <w:p/>
     <w:p/>
     <w:p/>
@@ -2687,7 +2919,6 @@
   <w:style w:type="character" w:default="1" w:styleId="Fuentedeprrafopredeter">
     <w:name w:val="Default Paragraph Font"/>
     <w:uiPriority w:val="1"/>
-    <w:semiHidden/>
     <w:unhideWhenUsed/>
   </w:style>
   <w:style w:type="table" w:default="1" w:styleId="Tablanormal">

</xml_diff>

<commit_message>
Finalización del formulario de actividades
Se actualizó los últimos detalles
</commit_message>
<xml_diff>
--- a/Formulario Actividades.docx
+++ b/Formulario Actividades.docx
@@ -647,7 +647,13 @@
               <w:spacing w:line="240" w:lineRule="auto"/>
             </w:pPr>
             <w:r>
-              <w:t>18:00</w:t>
+              <w:t>1</w:t>
+            </w:r>
+            <w:r>
+              <w:t>8</w:t>
+            </w:r>
+            <w:r>
+              <w:t>:00</w:t>
             </w:r>
           </w:p>
         </w:tc>
@@ -661,7 +667,10 @@
               <w:spacing w:line="240" w:lineRule="auto"/>
             </w:pPr>
             <w:r>
-              <w:t>20:00</w:t>
+              <w:t>20</w:t>
+            </w:r>
+            <w:r>
+              <w:t>:00</w:t>
             </w:r>
           </w:p>
         </w:tc>
@@ -674,6 +683,12 @@
               <w:widowControl w:val="0"/>
               <w:spacing w:line="240" w:lineRule="auto"/>
             </w:pPr>
+            <w:r>
+              <w:t>1</w:t>
+            </w:r>
+            <w:r>
+              <w:t>0</w:t>
+            </w:r>
           </w:p>
         </w:tc>
         <w:tc>
@@ -685,6 +700,12 @@
               <w:widowControl w:val="0"/>
               <w:spacing w:line="240" w:lineRule="auto"/>
             </w:pPr>
+            <w:r>
+              <w:t>1</w:t>
+            </w:r>
+            <w:r>
+              <w:t>10</w:t>
+            </w:r>
           </w:p>
         </w:tc>
         <w:tc>
@@ -710,6 +731,9 @@
               <w:widowControl w:val="0"/>
               <w:spacing w:line="240" w:lineRule="auto"/>
             </w:pPr>
+            <w:r>
+              <w:t>Nos tardamos mucho en revisar el documento.</w:t>
+            </w:r>
           </w:p>
         </w:tc>
       </w:tr>
@@ -765,6 +789,9 @@
               <w:widowControl w:val="0"/>
               <w:spacing w:line="240" w:lineRule="auto"/>
             </w:pPr>
+            <w:r>
+              <w:t>0</w:t>
+            </w:r>
           </w:p>
         </w:tc>
         <w:tc>
@@ -776,6 +803,9 @@
               <w:widowControl w:val="0"/>
               <w:spacing w:line="240" w:lineRule="auto"/>
             </w:pPr>
+            <w:r>
+              <w:t>15</w:t>
+            </w:r>
           </w:p>
         </w:tc>
         <w:tc>
@@ -801,6 +831,9 @@
               <w:widowControl w:val="0"/>
               <w:spacing w:line="240" w:lineRule="auto"/>
             </w:pPr>
+            <w:r>
+              <w:t>Realicé los documentos de la coevaluación.</w:t>
+            </w:r>
           </w:p>
         </w:tc>
       </w:tr>
@@ -2003,15 +2036,7 @@
               <w:spacing w:line="240" w:lineRule="auto"/>
             </w:pPr>
             <w:r>
-              <w:t xml:space="preserve">Leí el </w:t>
-            </w:r>
-            <w:proofErr w:type="spellStart"/>
-            <w:r>
-              <w:t>pdf</w:t>
-            </w:r>
-            <w:proofErr w:type="spellEnd"/>
-            <w:r>
-              <w:t xml:space="preserve"> de las instrucciones. </w:t>
+              <w:t xml:space="preserve">Leí el pdf de las instrucciones. </w:t>
             </w:r>
           </w:p>
         </w:tc>
@@ -2341,7 +2366,13 @@
               <w:spacing w:line="240" w:lineRule="auto"/>
             </w:pPr>
             <w:r>
-              <w:t>15:00</w:t>
+              <w:t>1</w:t>
+            </w:r>
+            <w:r>
+              <w:t>7</w:t>
+            </w:r>
+            <w:r>
+              <w:t>:00</w:t>
             </w:r>
           </w:p>
         </w:tc>
@@ -2511,15 +2542,7 @@
               <w:spacing w:line="240" w:lineRule="auto"/>
             </w:pPr>
             <w:r>
-              <w:t xml:space="preserve">Se entregó en </w:t>
-            </w:r>
-            <w:proofErr w:type="spellStart"/>
-            <w:r>
-              <w:t>canvas</w:t>
-            </w:r>
-            <w:proofErr w:type="spellEnd"/>
-            <w:r>
-              <w:t>.</w:t>
+              <w:t>Se entregó en canvas.</w:t>
             </w:r>
           </w:p>
         </w:tc>

</xml_diff>

<commit_message>
Finalización y corrección del Formulario
</commit_message>
<xml_diff>
--- a/Formulario Actividades.docx
+++ b/Formulario Actividades.docx
@@ -684,10 +684,7 @@
               <w:spacing w:line="240" w:lineRule="auto"/>
             </w:pPr>
             <w:r>
-              <w:t>1</w:t>
-            </w:r>
-            <w:r>
-              <w:t>0</w:t>
+              <w:t>10</w:t>
             </w:r>
           </w:p>
         </w:tc>
@@ -701,10 +698,7 @@
               <w:spacing w:line="240" w:lineRule="auto"/>
             </w:pPr>
             <w:r>
-              <w:t>1</w:t>
-            </w:r>
-            <w:r>
-              <w:t>10</w:t>
+              <w:t>110</w:t>
             </w:r>
           </w:p>
         </w:tc>
@@ -748,6 +742,106 @@
               <w:spacing w:line="240" w:lineRule="auto"/>
             </w:pPr>
             <w:r>
+              <w:t>18/09</w:t>
+            </w:r>
+          </w:p>
+        </w:tc>
+        <w:tc>
+          <w:tcPr>
+            <w:tcW w:w="810" w:type="dxa"/>
+          </w:tcPr>
+          <w:p>
+            <w:pPr>
+              <w:widowControl w:val="0"/>
+              <w:spacing w:line="240" w:lineRule="auto"/>
+            </w:pPr>
+            <w:r>
+              <w:t>20:00</w:t>
+            </w:r>
+          </w:p>
+        </w:tc>
+        <w:tc>
+          <w:tcPr>
+            <w:tcW w:w="795" w:type="dxa"/>
+          </w:tcPr>
+          <w:p>
+            <w:pPr>
+              <w:widowControl w:val="0"/>
+              <w:spacing w:line="240" w:lineRule="auto"/>
+            </w:pPr>
+            <w:r>
+              <w:t>20:20</w:t>
+            </w:r>
+          </w:p>
+        </w:tc>
+        <w:tc>
+          <w:tcPr>
+            <w:tcW w:w="1590" w:type="dxa"/>
+          </w:tcPr>
+          <w:p>
+            <w:pPr>
+              <w:widowControl w:val="0"/>
+              <w:spacing w:line="240" w:lineRule="auto"/>
+            </w:pPr>
+            <w:r>
+              <w:t>0</w:t>
+            </w:r>
+          </w:p>
+        </w:tc>
+        <w:tc>
+          <w:tcPr>
+            <w:tcW w:w="1260" w:type="dxa"/>
+          </w:tcPr>
+          <w:p>
+            <w:pPr>
+              <w:widowControl w:val="0"/>
+              <w:spacing w:line="240" w:lineRule="auto"/>
+            </w:pPr>
+            <w:r>
+              <w:t>20</w:t>
+            </w:r>
+          </w:p>
+        </w:tc>
+        <w:tc>
+          <w:tcPr>
+            <w:tcW w:w="1965" w:type="dxa"/>
+          </w:tcPr>
+          <w:p>
+            <w:pPr>
+              <w:widowControl w:val="0"/>
+              <w:spacing w:line="240" w:lineRule="auto"/>
+            </w:pPr>
+            <w:r>
+              <w:t>Muestra del prototipo a usuario</w:t>
+            </w:r>
+          </w:p>
+        </w:tc>
+        <w:tc>
+          <w:tcPr>
+            <w:tcW w:w="1620" w:type="dxa"/>
+          </w:tcPr>
+          <w:p>
+            <w:pPr>
+              <w:widowControl w:val="0"/>
+              <w:spacing w:line="240" w:lineRule="auto"/>
+            </w:pPr>
+            <w:r>
+              <w:t>Se explicó al usuario el funcionamiento y la dinámica general del prototipo.</w:t>
+            </w:r>
+          </w:p>
+        </w:tc>
+      </w:tr>
+      <w:tr>
+        <w:tc>
+          <w:tcPr>
+            <w:tcW w:w="885" w:type="dxa"/>
+          </w:tcPr>
+          <w:p>
+            <w:pPr>
+              <w:widowControl w:val="0"/>
+              <w:spacing w:line="240" w:lineRule="auto"/>
+            </w:pPr>
+            <w:r>
               <w:t>21/09</w:t>
             </w:r>
           </w:p>
@@ -838,11 +932,10 @@
         </w:tc>
       </w:tr>
     </w:tbl>
-    <w:p/>
     <w:p>
       <w:pPr>
         <w:spacing w:line="360" w:lineRule="auto"/>
-        <w:ind w:left="20" w:right="940"/>
+        <w:ind w:right="940"/>
         <w:rPr>
           <w:b/>
           <w:bCs/>
@@ -850,15 +943,6 @@
           <w:szCs w:val="24"/>
         </w:rPr>
       </w:pPr>
-      <w:r>
-        <w:rPr>
-          <w:b/>
-          <w:bCs/>
-          <w:sz w:val="24"/>
-          <w:szCs w:val="24"/>
-        </w:rPr>
-        <w:t>Formulario - Enmanuel García</w:t>
-      </w:r>
     </w:p>
     <w:tbl>
       <w:tblPr>
@@ -908,6 +992,7 @@
                 <w:b/>
                 <w:bCs/>
               </w:rPr>
+              <w:lastRenderedPageBreak/>
               <w:t>Fecha</w:t>
             </w:r>
           </w:p>
@@ -1587,6 +1672,120 @@
               <w:bottom w:val="single" w:sz="8" w:space="0" w:color="000000"/>
               <w:right w:val="single" w:sz="8" w:space="0" w:color="000000"/>
             </w:tcBorders>
+          </w:tcPr>
+          <w:p>
+            <w:r>
+              <w:t>18/09</w:t>
+            </w:r>
+          </w:p>
+        </w:tc>
+        <w:tc>
+          <w:tcPr>
+            <w:tcW w:w="810" w:type="dxa"/>
+            <w:tcBorders>
+              <w:top w:val="single" w:sz="8" w:space="0" w:color="000000"/>
+              <w:left w:val="single" w:sz="8" w:space="0" w:color="000000"/>
+              <w:bottom w:val="single" w:sz="8" w:space="0" w:color="000000"/>
+              <w:right w:val="single" w:sz="8" w:space="0" w:color="000000"/>
+            </w:tcBorders>
+          </w:tcPr>
+          <w:p>
+            <w:r>
+              <w:t>20:00</w:t>
+            </w:r>
+          </w:p>
+        </w:tc>
+        <w:tc>
+          <w:tcPr>
+            <w:tcW w:w="795" w:type="dxa"/>
+            <w:tcBorders>
+              <w:top w:val="single" w:sz="8" w:space="0" w:color="000000"/>
+              <w:left w:val="single" w:sz="8" w:space="0" w:color="000000"/>
+              <w:bottom w:val="single" w:sz="8" w:space="0" w:color="000000"/>
+              <w:right w:val="single" w:sz="8" w:space="0" w:color="000000"/>
+            </w:tcBorders>
+          </w:tcPr>
+          <w:p>
+            <w:r>
+              <w:t>20:20</w:t>
+            </w:r>
+          </w:p>
+        </w:tc>
+        <w:tc>
+          <w:tcPr>
+            <w:tcW w:w="1590" w:type="dxa"/>
+            <w:tcBorders>
+              <w:top w:val="single" w:sz="8" w:space="0" w:color="000000"/>
+              <w:left w:val="single" w:sz="8" w:space="0" w:color="000000"/>
+              <w:bottom w:val="single" w:sz="8" w:space="0" w:color="000000"/>
+              <w:right w:val="single" w:sz="8" w:space="0" w:color="000000"/>
+            </w:tcBorders>
+          </w:tcPr>
+          <w:p>
+            <w:r>
+              <w:t>0</w:t>
+            </w:r>
+          </w:p>
+        </w:tc>
+        <w:tc>
+          <w:tcPr>
+            <w:tcW w:w="1260" w:type="dxa"/>
+            <w:tcBorders>
+              <w:top w:val="single" w:sz="8" w:space="0" w:color="000000"/>
+              <w:left w:val="single" w:sz="8" w:space="0" w:color="000000"/>
+              <w:bottom w:val="single" w:sz="8" w:space="0" w:color="000000"/>
+              <w:right w:val="single" w:sz="8" w:space="0" w:color="000000"/>
+            </w:tcBorders>
+          </w:tcPr>
+          <w:p>
+            <w:r>
+              <w:t>20</w:t>
+            </w:r>
+          </w:p>
+        </w:tc>
+        <w:tc>
+          <w:tcPr>
+            <w:tcW w:w="1965" w:type="dxa"/>
+            <w:tcBorders>
+              <w:top w:val="single" w:sz="8" w:space="0" w:color="000000"/>
+              <w:left w:val="single" w:sz="8" w:space="0" w:color="000000"/>
+              <w:bottom w:val="single" w:sz="8" w:space="0" w:color="000000"/>
+              <w:right w:val="single" w:sz="8" w:space="0" w:color="000000"/>
+            </w:tcBorders>
+          </w:tcPr>
+          <w:p>
+            <w:r>
+              <w:t>Muestra del prototipo a usuario</w:t>
+            </w:r>
+          </w:p>
+        </w:tc>
+        <w:tc>
+          <w:tcPr>
+            <w:tcW w:w="1620" w:type="dxa"/>
+            <w:tcBorders>
+              <w:top w:val="single" w:sz="8" w:space="0" w:color="000000"/>
+              <w:left w:val="single" w:sz="8" w:space="0" w:color="000000"/>
+              <w:bottom w:val="single" w:sz="8" w:space="0" w:color="000000"/>
+              <w:right w:val="single" w:sz="8" w:space="0" w:color="000000"/>
+            </w:tcBorders>
+          </w:tcPr>
+          <w:p>
+            <w:r>
+              <w:t>Se observó la interacción del usuario con las diferentes vistas del prototipo.</w:t>
+            </w:r>
+          </w:p>
+        </w:tc>
+      </w:tr>
+      <w:tr>
+        <w:tc>
+          <w:tcPr>
+            <w:tcW w:w="885" w:type="dxa"/>
+            <w:tcBorders>
+              <w:top w:val="single" w:sz="8" w:space="0" w:color="000000"/>
+              <w:left w:val="single" w:sz="8" w:space="0" w:color="000000"/>
+              <w:bottom w:val="single" w:sz="8" w:space="0" w:color="000000"/>
+              <w:right w:val="single" w:sz="8" w:space="0" w:color="000000"/>
+            </w:tcBorders>
             <w:hideMark/>
           </w:tcPr>
           <w:p>
@@ -1708,20 +1907,6 @@
         </w:tc>
       </w:tr>
     </w:tbl>
-    <w:p>
-      <w:pPr>
-        <w:rPr>
-          <w:lang w:val="es-GT"/>
-        </w:rPr>
-      </w:pPr>
-    </w:p>
-    <w:p/>
-    <w:p/>
-    <w:p/>
-    <w:p/>
-    <w:p/>
-    <w:p/>
-    <w:p/>
     <w:p/>
     <w:p>
       <w:pPr>
@@ -1741,8 +1926,24 @@
           <w:sz w:val="24"/>
           <w:szCs w:val="24"/>
         </w:rPr>
-        <w:t>Formulario - Lourdes Lemus</w:t>
+        <w:t>Formulario - Enmanuel García</w:t>
       </w:r>
+    </w:p>
+    <w:p/>
+    <w:p/>
+    <w:p/>
+    <w:p/>
+    <w:p>
+      <w:pPr>
+        <w:spacing w:line="360" w:lineRule="auto"/>
+        <w:ind w:right="940"/>
+        <w:rPr>
+          <w:b/>
+          <w:bCs/>
+          <w:sz w:val="24"/>
+          <w:szCs w:val="24"/>
+        </w:rPr>
+      </w:pPr>
     </w:p>
     <w:tbl>
       <w:tblPr>
@@ -1787,6 +1988,7 @@
                 <w:b/>
                 <w:bCs/>
               </w:rPr>
+              <w:lastRenderedPageBreak/>
               <w:t>Fecha</w:t>
             </w:r>
           </w:p>
@@ -2036,7 +2238,15 @@
               <w:spacing w:line="240" w:lineRule="auto"/>
             </w:pPr>
             <w:r>
-              <w:t xml:space="preserve">Leí el pdf de las instrucciones. </w:t>
+              <w:t xml:space="preserve">Leí el </w:t>
+            </w:r>
+            <w:proofErr w:type="spellStart"/>
+            <w:r>
+              <w:t>pdf</w:t>
+            </w:r>
+            <w:proofErr w:type="spellEnd"/>
+            <w:r>
+              <w:t xml:space="preserve"> de las instrucciones. </w:t>
             </w:r>
           </w:p>
         </w:tc>
@@ -2458,6 +2668,106 @@
               <w:spacing w:line="240" w:lineRule="auto"/>
             </w:pPr>
             <w:r>
+              <w:t>18/09</w:t>
+            </w:r>
+          </w:p>
+        </w:tc>
+        <w:tc>
+          <w:tcPr>
+            <w:tcW w:w="810" w:type="dxa"/>
+          </w:tcPr>
+          <w:p>
+            <w:pPr>
+              <w:widowControl w:val="0"/>
+              <w:spacing w:line="240" w:lineRule="auto"/>
+            </w:pPr>
+            <w:r>
+              <w:t>20:00</w:t>
+            </w:r>
+          </w:p>
+        </w:tc>
+        <w:tc>
+          <w:tcPr>
+            <w:tcW w:w="795" w:type="dxa"/>
+          </w:tcPr>
+          <w:p>
+            <w:pPr>
+              <w:widowControl w:val="0"/>
+              <w:spacing w:line="240" w:lineRule="auto"/>
+            </w:pPr>
+            <w:r>
+              <w:t>20:20</w:t>
+            </w:r>
+          </w:p>
+        </w:tc>
+        <w:tc>
+          <w:tcPr>
+            <w:tcW w:w="1590" w:type="dxa"/>
+          </w:tcPr>
+          <w:p>
+            <w:pPr>
+              <w:widowControl w:val="0"/>
+              <w:spacing w:line="240" w:lineRule="auto"/>
+            </w:pPr>
+            <w:r>
+              <w:t>0</w:t>
+            </w:r>
+          </w:p>
+        </w:tc>
+        <w:tc>
+          <w:tcPr>
+            <w:tcW w:w="1260" w:type="dxa"/>
+          </w:tcPr>
+          <w:p>
+            <w:pPr>
+              <w:widowControl w:val="0"/>
+              <w:spacing w:line="240" w:lineRule="auto"/>
+            </w:pPr>
+            <w:r>
+              <w:t>20</w:t>
+            </w:r>
+          </w:p>
+        </w:tc>
+        <w:tc>
+          <w:tcPr>
+            <w:tcW w:w="1965" w:type="dxa"/>
+          </w:tcPr>
+          <w:p>
+            <w:pPr>
+              <w:widowControl w:val="0"/>
+              <w:spacing w:line="240" w:lineRule="auto"/>
+            </w:pPr>
+            <w:r>
+              <w:t>Muestra del prototipo a usuario</w:t>
+            </w:r>
+          </w:p>
+        </w:tc>
+        <w:tc>
+          <w:tcPr>
+            <w:tcW w:w="1620" w:type="dxa"/>
+          </w:tcPr>
+          <w:p>
+            <w:pPr>
+              <w:widowControl w:val="0"/>
+              <w:spacing w:line="240" w:lineRule="auto"/>
+            </w:pPr>
+            <w:r>
+              <w:t>Se recopilaron los comentarios y sugerencias proporcionados por el usuario.</w:t>
+            </w:r>
+          </w:p>
+        </w:tc>
+      </w:tr>
+      <w:tr>
+        <w:tc>
+          <w:tcPr>
+            <w:tcW w:w="885" w:type="dxa"/>
+          </w:tcPr>
+          <w:p>
+            <w:pPr>
+              <w:widowControl w:val="0"/>
+              <w:spacing w:line="240" w:lineRule="auto"/>
+            </w:pPr>
+            <w:r>
               <w:t>21/09</w:t>
             </w:r>
           </w:p>
@@ -2542,12 +2852,41 @@
               <w:spacing w:line="240" w:lineRule="auto"/>
             </w:pPr>
             <w:r>
-              <w:t>Se entregó en canvas.</w:t>
+              <w:t xml:space="preserve">Se entregó en </w:t>
+            </w:r>
+            <w:proofErr w:type="spellStart"/>
+            <w:r>
+              <w:t>canvas</w:t>
+            </w:r>
+            <w:proofErr w:type="spellEnd"/>
+            <w:r>
+              <w:t>.</w:t>
             </w:r>
           </w:p>
         </w:tc>
       </w:tr>
     </w:tbl>
+    <w:p>
+      <w:pPr>
+        <w:spacing w:line="360" w:lineRule="auto"/>
+        <w:ind w:left="20" w:right="940"/>
+        <w:rPr>
+          <w:b/>
+          <w:bCs/>
+          <w:sz w:val="24"/>
+          <w:szCs w:val="24"/>
+        </w:rPr>
+      </w:pPr>
+      <w:r>
+        <w:rPr>
+          <w:b/>
+          <w:bCs/>
+          <w:sz w:val="24"/>
+          <w:szCs w:val="24"/>
+        </w:rPr>
+        <w:t>Formulario - Lourdes Lemus</w:t>
+      </w:r>
+    </w:p>
     <w:p/>
     <w:p/>
     <w:sectPr>
@@ -3076,7 +3415,6 @@
   <w:style w:type="character" w:default="1" w:styleId="Fuentedeprrafopredeter">
     <w:name w:val="Default Paragraph Font"/>
     <w:uiPriority w:val="1"/>
-    <w:semiHidden/>
     <w:unhideWhenUsed/>
   </w:style>
   <w:style w:type="table" w:default="1" w:styleId="Tablanormal">

</xml_diff>